<commit_message>
feat: finance signed report
</commit_message>
<xml_diff>
--- a/Финансовая грамотность/доклад.docx
+++ b/Финансовая грамотность/доклад.docx
@@ -12,6 +12,76 @@
           <w:szCs w:val="28"/>
         </w:rPr>
       </w:pPr>
+      <w:r>
+        <w:rPr>
+          <w:rFonts w:eastAsia="Calibri"/>
+          <w:noProof/>
+          <w:sz w:val="28"/>
+          <w:szCs w:val="28"/>
+        </w:rPr>
+        <w:drawing>
+          <wp:anchor distT="0" distB="0" distL="114300" distR="114300" simplePos="0" relativeHeight="251658240" behindDoc="0" locked="0" layoutInCell="1" allowOverlap="1" wp14:anchorId="559C6645" wp14:editId="272041C1">
+            <wp:simplePos x="0" y="0"/>
+            <wp:positionH relativeFrom="column">
+              <wp:posOffset>-989965</wp:posOffset>
+            </wp:positionH>
+            <wp:positionV relativeFrom="paragraph">
+              <wp:posOffset>-660400</wp:posOffset>
+            </wp:positionV>
+            <wp:extent cx="7558088" cy="10768096"/>
+            <wp:effectExtent l="0" t="0" r="5080" b="0"/>
+            <wp:wrapNone/>
+            <wp:docPr id="1" name="Рисунок 1"/>
+            <wp:cNvGraphicFramePr>
+              <a:graphicFrameLocks xmlns:a="http://schemas.openxmlformats.org/drawingml/2006/main" noChangeAspect="1"/>
+            </wp:cNvGraphicFramePr>
+            <a:graphic xmlns:a="http://schemas.openxmlformats.org/drawingml/2006/main">
+              <a:graphicData uri="http://schemas.openxmlformats.org/drawingml/2006/picture">
+                <pic:pic xmlns:pic="http://schemas.openxmlformats.org/drawingml/2006/picture">
+                  <pic:nvPicPr>
+                    <pic:cNvPr id="0" name="Picture 1"/>
+                    <pic:cNvPicPr>
+                      <a:picLocks noChangeAspect="1" noChangeArrowheads="1"/>
+                    </pic:cNvPicPr>
+                  </pic:nvPicPr>
+                  <pic:blipFill>
+                    <a:blip r:embed="rId8">
+                      <a:extLst>
+                        <a:ext uri="{28A0092B-C50C-407E-A947-70E740481C1C}">
+                          <a14:useLocalDpi xmlns:a14="http://schemas.microsoft.com/office/drawing/2010/main" val="0"/>
+                        </a:ext>
+                      </a:extLst>
+                    </a:blip>
+                    <a:srcRect/>
+                    <a:stretch>
+                      <a:fillRect/>
+                    </a:stretch>
+                  </pic:blipFill>
+                  <pic:spPr bwMode="auto">
+                    <a:xfrm>
+                      <a:off x="0" y="0"/>
+                      <a:ext cx="7564604" cy="10777380"/>
+                    </a:xfrm>
+                    <a:prstGeom prst="rect">
+                      <a:avLst/>
+                    </a:prstGeom>
+                    <a:noFill/>
+                    <a:ln>
+                      <a:noFill/>
+                    </a:ln>
+                  </pic:spPr>
+                </pic:pic>
+              </a:graphicData>
+            </a:graphic>
+            <wp14:sizeRelH relativeFrom="margin">
+              <wp14:pctWidth>0</wp14:pctWidth>
+            </wp14:sizeRelH>
+            <wp14:sizeRelV relativeFrom="margin">
+              <wp14:pctHeight>0</wp14:pctHeight>
+            </wp14:sizeRelV>
+          </wp:anchor>
+        </w:drawing>
+      </w:r>
       <w:r>
         <w:rPr>
           <w:rFonts w:eastAsia="Calibri"/>
@@ -743,8 +813,6 @@
           <w:r>
             <w:rPr>
               <w:rStyle w:val="user"/>
-              <w:sz w:val="28"/>
-              <w:szCs w:val="28"/>
             </w:rPr>
             <w:fldChar w:fldCharType="separate"/>
           </w:r>
@@ -2207,9 +2275,9 @@
       </w:r>
     </w:p>
     <w:sectPr>
-      <w:footerReference w:type="even" r:id="rId8"/>
-      <w:footerReference w:type="default" r:id="rId9"/>
-      <w:footerReference w:type="first" r:id="rId10"/>
+      <w:footerReference w:type="even" r:id="rId9"/>
+      <w:footerReference w:type="default" r:id="rId10"/>
+      <w:footerReference w:type="first" r:id="rId11"/>
       <w:pgSz w:w="11906" w:h="16838"/>
       <w:pgMar w:top="1040" w:right="708" w:bottom="1340" w:left="1559" w:header="0" w:footer="1143" w:gutter="0"/>
       <w:cols w:space="720"/>
@@ -3929,6 +3997,7 @@
   <w:style w:type="character" w:default="1" w:styleId="a0">
     <w:name w:val="Default Paragraph Font"/>
     <w:uiPriority w:val="1"/>
+    <w:semiHidden/>
     <w:unhideWhenUsed/>
   </w:style>
   <w:style w:type="table" w:default="1" w:styleId="a1">

</xml_diff>